<commit_message>
Setup Phone Bridge - SIP Trunk - Telnyx+Livekit
</commit_message>
<xml_diff>
--- a/docs/Architecture.docx
+++ b/docs/Architecture.docx
@@ -23,13 +23,8 @@
       </w:r>
     </w:p>
     <w:p>
-      <w:proofErr w:type="spellStart"/>
-      <w:r>
-        <w:t>LiveKit</w:t>
-      </w:r>
-      <w:proofErr w:type="spellEnd"/>
-      <w:r>
-        <w:t xml:space="preserve"> agent</w:t>
+      <w:r>
+        <w:t>LiveKit agent</w:t>
       </w:r>
     </w:p>
     <w:p>
@@ -100,15 +95,7 @@
     <w:p/>
     <w:p>
       <w:r>
-        <w:t xml:space="preserve">You need the telephony provider </w:t>
-      </w:r>
-      <w:proofErr w:type="gramStart"/>
-      <w:r>
-        <w:t>to</w:t>
-      </w:r>
-      <w:proofErr w:type="gramEnd"/>
-      <w:r>
-        <w:t>:</w:t>
+        <w:t>You need the telephony provider to:</w:t>
       </w:r>
     </w:p>
     <w:p>
@@ -130,15 +117,7 @@
         </w:numPr>
       </w:pPr>
       <w:r>
-        <w:t xml:space="preserve">Stream caller audio to </w:t>
-      </w:r>
-      <w:proofErr w:type="spellStart"/>
-      <w:r>
-        <w:t>LiveKit</w:t>
-      </w:r>
-      <w:proofErr w:type="spellEnd"/>
-      <w:r>
-        <w:t>.</w:t>
+        <w:t>Stream caller audio to LiveKit.</w:t>
       </w:r>
     </w:p>
     <w:p>
@@ -149,15 +128,7 @@
         </w:numPr>
       </w:pPr>
       <w:r>
-        <w:t xml:space="preserve">Receive synthesized audio from </w:t>
-      </w:r>
-      <w:proofErr w:type="spellStart"/>
-      <w:r>
-        <w:t>LiveKit</w:t>
-      </w:r>
-      <w:proofErr w:type="spellEnd"/>
-      <w:r>
-        <w:t>.</w:t>
+        <w:t>Receive synthesized audio from LiveKit.</w:t>
       </w:r>
     </w:p>
     <w:p>
@@ -172,6 +143,591 @@
       </w:r>
     </w:p>
     <w:p/>
+    <w:p/>
+    <w:p/>
+    <w:p>
+      <w:r>
+        <w:t>A SIP trunk lets software—here, LiveKit—enter that phone network and place a real call.</w:t>
+      </w:r>
+    </w:p>
+    <w:p/>
+    <w:p>
+      <w:r>
+        <w:t>See this documentation for more about architectures</w:t>
+      </w:r>
+      <w:r>
+        <w:t xml:space="preserve"> of voice applications</w:t>
+      </w:r>
+      <w:r>
+        <w:t>:</w:t>
+      </w:r>
+    </w:p>
+    <w:p>
+      <w:hyperlink r:id="rId5" w:history="1">
+        <w:r>
+          <w:rPr>
+            <w:rStyle w:val="Hyperlink"/>
+          </w:rPr>
+          <w:t>https://livekit.com/blog/realtime-vs-cascade</w:t>
+        </w:r>
+      </w:hyperlink>
+    </w:p>
+    <w:p/>
+    <w:p/>
+    <w:p/>
+    <w:p/>
+    <w:p>
+      <w:r>
+        <w:lastRenderedPageBreak/>
+        <w:t>Free Tier:</w:t>
+      </w:r>
+    </w:p>
+    <w:p>
+      <w:pPr>
+        <w:rPr>
+          <w:b/>
+          <w:bCs/>
+        </w:rPr>
+      </w:pPr>
+      <w:r>
+        <w:rPr>
+          <w:b/>
+          <w:bCs/>
+        </w:rPr>
+        <w:t xml:space="preserve">Third-party SIP minutes </w:t>
+      </w:r>
+    </w:p>
+    <w:p>
+      <w:r>
+        <w:t>Inbound and outbound minutes using a third-party SIP trunk</w:t>
+      </w:r>
+    </w:p>
+    <w:p>
+      <w:r>
+        <w:t>1,000 minutes included</w:t>
+      </w:r>
+    </w:p>
+    <w:p/>
+    <w:p>
+      <w:hyperlink r:id="rId6" w:history="1">
+        <w:r>
+          <w:rPr>
+            <w:rStyle w:val="Hyperlink"/>
+          </w:rPr>
+          <w:t>https://huggingface.co/scrappylabsai/scrappy-voice-family-1/blob/main/samples/scrappy_intro.wav</w:t>
+        </w:r>
+      </w:hyperlink>
+    </w:p>
+    <w:p/>
+    <w:p>
+      <w:r>
+        <w:rPr>
+          <w:b/>
+          <w:bCs/>
+        </w:rPr>
+        <w:t>TTS(Text-to-speech)</w:t>
+      </w:r>
+    </w:p>
+    <w:p>
+      <w:r>
+        <w:t>Fish Audio S2.1 Pro Free</w:t>
+      </w:r>
+    </w:p>
+    <w:p>
+      <w:r>
+        <w:t>Free</w:t>
+      </w:r>
+    </w:p>
+    <w:p>
+      <w:r>
+        <w:rPr>
+          <w:b/>
+          <w:bCs/>
+        </w:rPr>
+        <w:t>TTS(Text-to-speech)</w:t>
+      </w:r>
+    </w:p>
+    <w:p>
+      <w:r>
+        <w:t>Gradium TTS</w:t>
+      </w:r>
+      <w:r>
+        <w:t xml:space="preserve">   -- </w:t>
+      </w:r>
+    </w:p>
+    <w:p>
+      <w:r>
+        <w:t>Free</w:t>
+      </w:r>
+    </w:p>
+    <w:p>
+      <w:pPr>
+        <w:rPr>
+          <w:color w:val="EE0000"/>
+        </w:rPr>
+      </w:pPr>
+      <w:r>
+        <w:t xml:space="preserve">Watch for each models : </w:t>
+      </w:r>
+      <w:r>
+        <w:rPr>
+          <w:color w:val="EE0000"/>
+        </w:rPr>
+        <w:t>median time-to-first-audio (TTFA)</w:t>
+      </w:r>
+    </w:p>
+    <w:p>
+      <w:pPr>
+        <w:rPr>
+          <w:color w:val="EE0000"/>
+        </w:rPr>
+      </w:pPr>
+    </w:p>
+    <w:p>
+      <w:pPr>
+        <w:rPr>
+          <w:b/>
+          <w:bCs/>
+        </w:rPr>
+      </w:pPr>
+      <w:r>
+        <w:rPr>
+          <w:b/>
+          <w:bCs/>
+        </w:rPr>
+        <w:t>How LiveKit Handles the Heavy Lifting</w:t>
+      </w:r>
+    </w:p>
+    <w:p>
+      <w:pPr>
+        <w:numPr>
+          <w:ilvl w:val="0"/>
+          <w:numId w:val="2"/>
+        </w:numPr>
+      </w:pPr>
+      <w:r>
+        <w:rPr>
+          <w:b/>
+          <w:bCs/>
+        </w:rPr>
+        <w:t xml:space="preserve">Incoming Audio (User </w:t>
+      </w:r>
+      <w:r>
+        <w:rPr>
+          <w:rFonts w:ascii="Segoe UI Symbol" w:hAnsi="Segoe UI Symbol" w:cs="Segoe UI Symbol"/>
+          <w:b/>
+          <w:bCs/>
+        </w:rPr>
+        <w:t>➔</w:t>
+      </w:r>
+      <w:r>
+        <w:rPr>
+          <w:b/>
+          <w:bCs/>
+        </w:rPr>
+        <w:t xml:space="preserve"> STT):</w:t>
+      </w:r>
+      <w:r>
+        <w:t xml:space="preserve"> The user speaks into their mic. LiveKit streams their audio into the room via WebRTC. Your Python/Node.js agent receives this as an audio track. The LiveKit framework automatically converts that WebRTC stream into raw audio buffers (PCM chunks) and feeds them directly into your </w:t>
+      </w:r>
+      <w:r>
+        <w:rPr>
+          <w:b/>
+          <w:bCs/>
+        </w:rPr>
+        <w:t>STT</w:t>
+      </w:r>
+      <w:r>
+        <w:t xml:space="preserve"> component.</w:t>
+      </w:r>
+    </w:p>
+    <w:p>
+      <w:pPr>
+        <w:numPr>
+          <w:ilvl w:val="0"/>
+          <w:numId w:val="2"/>
+        </w:numPr>
+      </w:pPr>
+      <w:r>
+        <w:rPr>
+          <w:b/>
+          <w:bCs/>
+        </w:rPr>
+        <w:t xml:space="preserve">The Processing Loop (STT </w:t>
+      </w:r>
+      <w:r>
+        <w:rPr>
+          <w:rFonts w:ascii="Segoe UI Symbol" w:hAnsi="Segoe UI Symbol" w:cs="Segoe UI Symbol"/>
+          <w:b/>
+          <w:bCs/>
+        </w:rPr>
+        <w:t>➔</w:t>
+      </w:r>
+      <w:r>
+        <w:rPr>
+          <w:b/>
+          <w:bCs/>
+        </w:rPr>
+        <w:t xml:space="preserve"> LLM </w:t>
+      </w:r>
+      <w:r>
+        <w:rPr>
+          <w:rFonts w:ascii="Segoe UI Symbol" w:hAnsi="Segoe UI Symbol" w:cs="Segoe UI Symbol"/>
+          <w:b/>
+          <w:bCs/>
+        </w:rPr>
+        <w:t>➔</w:t>
+      </w:r>
+      <w:r>
+        <w:rPr>
+          <w:b/>
+          <w:bCs/>
+        </w:rPr>
+        <w:t xml:space="preserve"> TTS):</w:t>
+      </w:r>
+      <w:r>
+        <w:t xml:space="preserve"> Your agent processes the text via the LLM and sends the text response to </w:t>
+      </w:r>
+      <w:r>
+        <w:rPr>
+          <w:b/>
+          <w:bCs/>
+        </w:rPr>
+        <w:t>Rime Mist v3</w:t>
+      </w:r>
+      <w:r>
+        <w:t>.</w:t>
+      </w:r>
+    </w:p>
+    <w:p>
+      <w:pPr>
+        <w:numPr>
+          <w:ilvl w:val="0"/>
+          <w:numId w:val="2"/>
+        </w:numPr>
+      </w:pPr>
+      <w:r>
+        <w:rPr>
+          <w:b/>
+          <w:bCs/>
+        </w:rPr>
+        <w:t xml:space="preserve">Outgoing Audio (TTS </w:t>
+      </w:r>
+      <w:r>
+        <w:rPr>
+          <w:rFonts w:ascii="Segoe UI Symbol" w:hAnsi="Segoe UI Symbol" w:cs="Segoe UI Symbol"/>
+          <w:b/>
+          <w:bCs/>
+        </w:rPr>
+        <w:t>➔</w:t>
+      </w:r>
+      <w:r>
+        <w:rPr>
+          <w:b/>
+          <w:bCs/>
+        </w:rPr>
+        <w:t xml:space="preserve"> User):</w:t>
+      </w:r>
+      <w:r>
+        <w:t xml:space="preserve"> Mist v3 generates raw audio bytes. You simply push these bytes into a LiveKit AudioSource. The LiveKit framework instantly takes those raw bytes, encodes them (usually using the Opus codec), packages them into RTP packets, and streams them back to the room over </w:t>
+      </w:r>
+      <w:r>
+        <w:rPr>
+          <w:b/>
+          <w:bCs/>
+        </w:rPr>
+        <w:t>WebRTC</w:t>
+      </w:r>
+      <w:r>
+        <w:t xml:space="preserve"> automatically.</w:t>
+      </w:r>
+    </w:p>
+    <w:p>
+      <w:r>
+        <w:rPr>
+          <w:noProof/>
+        </w:rPr>
+        <w:lastRenderedPageBreak/>
+        <w:drawing>
+          <wp:inline distT="0" distB="0" distL="0" distR="0" wp14:anchorId="778A2833" wp14:editId="516D0466">
+            <wp:extent cx="5943600" cy="1558290"/>
+            <wp:effectExtent l="0" t="0" r="0" b="3810"/>
+            <wp:docPr id="1676790441" name="Picture 1"/>
+            <wp:cNvGraphicFramePr>
+              <a:graphicFrameLocks xmlns:a="http://schemas.openxmlformats.org/drawingml/2006/main" noChangeAspect="1"/>
+            </wp:cNvGraphicFramePr>
+            <a:graphic xmlns:a="http://schemas.openxmlformats.org/drawingml/2006/main">
+              <a:graphicData uri="http://schemas.openxmlformats.org/drawingml/2006/picture">
+                <pic:pic xmlns:pic="http://schemas.openxmlformats.org/drawingml/2006/picture">
+                  <pic:nvPicPr>
+                    <pic:cNvPr id="1676790441" name=""/>
+                    <pic:cNvPicPr/>
+                  </pic:nvPicPr>
+                  <pic:blipFill>
+                    <a:blip r:embed="rId7"/>
+                    <a:stretch>
+                      <a:fillRect/>
+                    </a:stretch>
+                  </pic:blipFill>
+                  <pic:spPr>
+                    <a:xfrm>
+                      <a:off x="0" y="0"/>
+                      <a:ext cx="5943600" cy="1558290"/>
+                    </a:xfrm>
+                    <a:prstGeom prst="rect">
+                      <a:avLst/>
+                    </a:prstGeom>
+                  </pic:spPr>
+                </pic:pic>
+              </a:graphicData>
+            </a:graphic>
+          </wp:inline>
+        </w:drawing>
+      </w:r>
+    </w:p>
+    <w:p/>
+    <w:p>
+      <w:r>
+        <w:t xml:space="preserve">Light weight STT Models - </w:t>
+      </w:r>
+      <w:r>
+        <w:br/>
+      </w:r>
+      <w:r>
+        <w:tab/>
+        <w:t>nvidia Canary 180M Flash – vs Opean AI – Distil-Wishper</w:t>
+      </w:r>
+    </w:p>
+    <w:p/>
+    <w:p/>
+    <w:p>
+      <w:pPr>
+        <w:rPr>
+          <w:b/>
+          <w:bCs/>
+        </w:rPr>
+      </w:pPr>
+      <w:r>
+        <w:t xml:space="preserve">STT – Nvidia </w:t>
+      </w:r>
+      <w:r>
+        <w:rPr>
+          <w:b/>
+          <w:bCs/>
+        </w:rPr>
+        <w:t>Canary 180M Flash</w:t>
+      </w:r>
+    </w:p>
+    <w:p>
+      <w:pPr>
+        <w:rPr>
+          <w:b/>
+          <w:bCs/>
+        </w:rPr>
+      </w:pPr>
+      <w:r>
+        <w:rPr>
+          <w:b/>
+          <w:bCs/>
+        </w:rPr>
+        <w:t xml:space="preserve">TTS </w:t>
+      </w:r>
+      <w:r>
+        <w:rPr>
+          <w:b/>
+          <w:bCs/>
+        </w:rPr>
+        <w:t>–</w:t>
+      </w:r>
+      <w:r>
+        <w:rPr>
+          <w:b/>
+          <w:bCs/>
+        </w:rPr>
+        <w:t xml:space="preserve"> </w:t>
+      </w:r>
+      <w:r>
+        <w:rPr>
+          <w:b/>
+          <w:bCs/>
+        </w:rPr>
+        <w:t>Free version of LiveKit (</w:t>
+      </w:r>
+      <w:r>
+        <w:rPr>
+          <w:b/>
+          <w:bCs/>
+        </w:rPr>
+        <w:t>MIST</w:t>
+      </w:r>
+      <w:r>
+        <w:rPr>
+          <w:b/>
+          <w:bCs/>
+        </w:rPr>
+        <w:t xml:space="preserve"> V3)</w:t>
+      </w:r>
+    </w:p>
+    <w:p>
+      <w:pPr>
+        <w:rPr>
+          <w:b/>
+          <w:bCs/>
+        </w:rPr>
+      </w:pPr>
+      <w:r>
+        <w:rPr>
+          <w:b/>
+          <w:bCs/>
+        </w:rPr>
+        <w:t>LLM – google API</w:t>
+      </w:r>
+    </w:p>
+    <w:tbl>
+      <w:tblPr>
+        <w:tblW w:w="11712" w:type="dxa"/>
+        <w:tblBorders>
+          <w:top w:val="single" w:sz="6" w:space="0" w:color="1A1A1A"/>
+          <w:left w:val="single" w:sz="6" w:space="0" w:color="1A1A1A"/>
+          <w:bottom w:val="single" w:sz="6" w:space="0" w:color="1A1A1A"/>
+          <w:right w:val="single" w:sz="6" w:space="0" w:color="1A1A1A"/>
+        </w:tblBorders>
+        <w:shd w:val="clear" w:color="auto" w:fill="111111"/>
+        <w:tblCellMar>
+          <w:top w:w="15" w:type="dxa"/>
+          <w:left w:w="15" w:type="dxa"/>
+          <w:bottom w:w="15" w:type="dxa"/>
+          <w:right w:w="15" w:type="dxa"/>
+        </w:tblCellMar>
+        <w:tblLook w:val="04A0" w:firstRow="1" w:lastRow="0" w:firstColumn="1" w:lastColumn="0" w:noHBand="0" w:noVBand="1"/>
+      </w:tblPr>
+      <w:tblGrid>
+        <w:gridCol w:w="2005"/>
+        <w:gridCol w:w="1749"/>
+        <w:gridCol w:w="520"/>
+        <w:gridCol w:w="3072"/>
+        <w:gridCol w:w="4366"/>
+      </w:tblGrid>
+      <w:tr>
+        <w:tc>
+          <w:tcPr>
+            <w:tcW w:w="0" w:type="auto"/>
+            <w:tcBorders>
+              <w:top w:val="single" w:sz="2" w:space="0" w:color="auto"/>
+              <w:left w:val="single" w:sz="2" w:space="0" w:color="auto"/>
+              <w:bottom w:val="single" w:sz="6" w:space="0" w:color="auto"/>
+              <w:right w:val="single" w:sz="2" w:space="0" w:color="auto"/>
+            </w:tcBorders>
+            <w:shd w:val="clear" w:color="auto" w:fill="000000"/>
+            <w:vAlign w:val="center"/>
+            <w:hideMark/>
+          </w:tcPr>
+          <w:p>
+            <w:r>
+              <w:rPr>
+                <w:b/>
+                <w:bCs/>
+              </w:rPr>
+              <w:t>NVIDIA TTS NIM</w:t>
+            </w:r>
+          </w:p>
+        </w:tc>
+        <w:tc>
+          <w:tcPr>
+            <w:tcW w:w="0" w:type="auto"/>
+            <w:tcBorders>
+              <w:top w:val="single" w:sz="2" w:space="0" w:color="auto"/>
+              <w:left w:val="single" w:sz="6" w:space="0" w:color="364150"/>
+              <w:bottom w:val="single" w:sz="6" w:space="0" w:color="auto"/>
+              <w:right w:val="single" w:sz="2" w:space="0" w:color="auto"/>
+            </w:tcBorders>
+            <w:shd w:val="clear" w:color="auto" w:fill="000000"/>
+            <w:vAlign w:val="center"/>
+            <w:hideMark/>
+          </w:tcPr>
+          <w:p>
+            <w:r>
+              <w:t>Nemotron TTS</w:t>
+            </w:r>
+          </w:p>
+        </w:tc>
+        <w:tc>
+          <w:tcPr>
+            <w:tcW w:w="0" w:type="auto"/>
+            <w:tcBorders>
+              <w:top w:val="single" w:sz="2" w:space="0" w:color="auto"/>
+              <w:left w:val="single" w:sz="6" w:space="0" w:color="364150"/>
+              <w:bottom w:val="single" w:sz="6" w:space="0" w:color="auto"/>
+              <w:right w:val="single" w:sz="2" w:space="0" w:color="auto"/>
+            </w:tcBorders>
+            <w:shd w:val="clear" w:color="auto" w:fill="000000"/>
+            <w:vAlign w:val="center"/>
+            <w:hideMark/>
+          </w:tcPr>
+          <w:p>
+            <w:r>
+              <w:t>Text</w:t>
+            </w:r>
+          </w:p>
+        </w:tc>
+        <w:tc>
+          <w:tcPr>
+            <w:tcW w:w="0" w:type="auto"/>
+            <w:tcBorders>
+              <w:top w:val="single" w:sz="2" w:space="0" w:color="auto"/>
+              <w:left w:val="single" w:sz="6" w:space="0" w:color="364150"/>
+              <w:bottom w:val="single" w:sz="6" w:space="0" w:color="auto"/>
+              <w:right w:val="single" w:sz="2" w:space="0" w:color="auto"/>
+            </w:tcBorders>
+            <w:shd w:val="clear" w:color="auto" w:fill="000000"/>
+            <w:vAlign w:val="center"/>
+            <w:hideMark/>
+          </w:tcPr>
+          <w:p>
+            <w:r>
+              <w:t>Synthesized speech audio</w:t>
+            </w:r>
+          </w:p>
+        </w:tc>
+        <w:tc>
+          <w:tcPr>
+            <w:tcW w:w="0" w:type="auto"/>
+            <w:tcBorders>
+              <w:top w:val="single" w:sz="2" w:space="0" w:color="auto"/>
+              <w:left w:val="single" w:sz="6" w:space="0" w:color="364150"/>
+              <w:bottom w:val="single" w:sz="6" w:space="0" w:color="auto"/>
+              <w:right w:val="single" w:sz="2" w:space="0" w:color="auto"/>
+            </w:tcBorders>
+            <w:shd w:val="clear" w:color="auto" w:fill="000000"/>
+            <w:vAlign w:val="center"/>
+            <w:hideMark/>
+          </w:tcPr>
+          <w:p>
+            <w:r>
+              <w:t>gRPC (port 50051), HTTP (port 9000)</w:t>
+            </w:r>
+          </w:p>
+        </w:tc>
+      </w:tr>
+    </w:tbl>
+    <w:p/>
+    <w:p>
+      <w:r>
+        <w:t xml:space="preserve">Cnary 180M Flash – No </w:t>
+      </w:r>
+      <w:r>
+        <w:t>inverse text normalization (ITN)</w:t>
+      </w:r>
+      <w:r>
+        <w:t xml:space="preserve"> – ten </w:t>
+      </w:r>
+      <w:r>
+        <w:sym w:font="Wingdings" w:char="F0E0"/>
+      </w:r>
+      <w:r>
+        <w:t xml:space="preserve"> 10</w:t>
+      </w:r>
+    </w:p>
     <w:sectPr>
       <w:pgSz w:w="12240" w:h="15840"/>
       <w:pgMar w:top="1440" w:right="1440" w:bottom="1440" w:left="1440" w:header="720" w:footer="720" w:gutter="0"/>
@@ -297,8 +853,124 @@
       </w:pPr>
     </w:lvl>
   </w:abstractNum>
+  <w:abstractNum w:abstractNumId="1" w15:restartNumberingAfterBreak="0">
+    <w:nsid w:val="76A55E73"/>
+    <w:multiLevelType w:val="multilevel"/>
+    <w:tmpl w:val="660C3EA8"/>
+    <w:lvl w:ilvl="0">
+      <w:start w:val="1"/>
+      <w:numFmt w:val="decimal"/>
+      <w:lvlText w:val="%1."/>
+      <w:lvlJc w:val="left"/>
+      <w:pPr>
+        <w:tabs>
+          <w:tab w:val="num" w:pos="720"/>
+        </w:tabs>
+        <w:ind w:left="720" w:hanging="360"/>
+      </w:pPr>
+    </w:lvl>
+    <w:lvl w:ilvl="1" w:tentative="1">
+      <w:start w:val="1"/>
+      <w:numFmt w:val="decimal"/>
+      <w:lvlText w:val="%2."/>
+      <w:lvlJc w:val="left"/>
+      <w:pPr>
+        <w:tabs>
+          <w:tab w:val="num" w:pos="1440"/>
+        </w:tabs>
+        <w:ind w:left="1440" w:hanging="360"/>
+      </w:pPr>
+    </w:lvl>
+    <w:lvl w:ilvl="2" w:tentative="1">
+      <w:start w:val="1"/>
+      <w:numFmt w:val="decimal"/>
+      <w:lvlText w:val="%3."/>
+      <w:lvlJc w:val="left"/>
+      <w:pPr>
+        <w:tabs>
+          <w:tab w:val="num" w:pos="2160"/>
+        </w:tabs>
+        <w:ind w:left="2160" w:hanging="360"/>
+      </w:pPr>
+    </w:lvl>
+    <w:lvl w:ilvl="3" w:tentative="1">
+      <w:start w:val="1"/>
+      <w:numFmt w:val="decimal"/>
+      <w:lvlText w:val="%4."/>
+      <w:lvlJc w:val="left"/>
+      <w:pPr>
+        <w:tabs>
+          <w:tab w:val="num" w:pos="2880"/>
+        </w:tabs>
+        <w:ind w:left="2880" w:hanging="360"/>
+      </w:pPr>
+    </w:lvl>
+    <w:lvl w:ilvl="4" w:tentative="1">
+      <w:start w:val="1"/>
+      <w:numFmt w:val="decimal"/>
+      <w:lvlText w:val="%5."/>
+      <w:lvlJc w:val="left"/>
+      <w:pPr>
+        <w:tabs>
+          <w:tab w:val="num" w:pos="3600"/>
+        </w:tabs>
+        <w:ind w:left="3600" w:hanging="360"/>
+      </w:pPr>
+    </w:lvl>
+    <w:lvl w:ilvl="5" w:tentative="1">
+      <w:start w:val="1"/>
+      <w:numFmt w:val="decimal"/>
+      <w:lvlText w:val="%6."/>
+      <w:lvlJc w:val="left"/>
+      <w:pPr>
+        <w:tabs>
+          <w:tab w:val="num" w:pos="4320"/>
+        </w:tabs>
+        <w:ind w:left="4320" w:hanging="360"/>
+      </w:pPr>
+    </w:lvl>
+    <w:lvl w:ilvl="6" w:tentative="1">
+      <w:start w:val="1"/>
+      <w:numFmt w:val="decimal"/>
+      <w:lvlText w:val="%7."/>
+      <w:lvlJc w:val="left"/>
+      <w:pPr>
+        <w:tabs>
+          <w:tab w:val="num" w:pos="5040"/>
+        </w:tabs>
+        <w:ind w:left="5040" w:hanging="360"/>
+      </w:pPr>
+    </w:lvl>
+    <w:lvl w:ilvl="7" w:tentative="1">
+      <w:start w:val="1"/>
+      <w:numFmt w:val="decimal"/>
+      <w:lvlText w:val="%8."/>
+      <w:lvlJc w:val="left"/>
+      <w:pPr>
+        <w:tabs>
+          <w:tab w:val="num" w:pos="5760"/>
+        </w:tabs>
+        <w:ind w:left="5760" w:hanging="360"/>
+      </w:pPr>
+    </w:lvl>
+    <w:lvl w:ilvl="8" w:tentative="1">
+      <w:start w:val="1"/>
+      <w:numFmt w:val="decimal"/>
+      <w:lvlText w:val="%9."/>
+      <w:lvlJc w:val="left"/>
+      <w:pPr>
+        <w:tabs>
+          <w:tab w:val="num" w:pos="6480"/>
+        </w:tabs>
+        <w:ind w:left="6480" w:hanging="360"/>
+      </w:pPr>
+    </w:lvl>
+  </w:abstractNum>
   <w:num w:numId="1" w16cid:durableId="1483501694">
     <w:abstractNumId w:val="0"/>
+  </w:num>
+  <w:num w:numId="2" w16cid:durableId="525482796">
+    <w:abstractNumId w:val="1"/>
   </w:num>
 </w:numbering>
 </file>
@@ -754,7 +1426,6 @@
     <w:next w:val="Normal"/>
     <w:link w:val="Heading3Char"/>
     <w:uiPriority w:val="9"/>
-    <w:semiHidden/>
     <w:unhideWhenUsed/>
     <w:qFormat/>
     <w:rsid w:val="00E752FD"/>
@@ -961,7 +1632,6 @@
     <w:basedOn w:val="DefaultParagraphFont"/>
     <w:link w:val="Heading3"/>
     <w:uiPriority w:val="9"/>
-    <w:semiHidden/>
     <w:rsid w:val="00E752FD"/>
     <w:rPr>
       <w:rFonts w:eastAsiaTheme="majorEastAsia" w:cstheme="majorBidi"/>
@@ -1217,6 +1887,29 @@
       <w:smallCaps/>
       <w:color w:val="2F5496" w:themeColor="accent1" w:themeShade="BF"/>
       <w:spacing w:val="5"/>
+    </w:rPr>
+  </w:style>
+  <w:style w:type="character" w:styleId="Hyperlink">
+    <w:name w:val="Hyperlink"/>
+    <w:basedOn w:val="DefaultParagraphFont"/>
+    <w:uiPriority w:val="99"/>
+    <w:unhideWhenUsed/>
+    <w:rsid w:val="0058407C"/>
+    <w:rPr>
+      <w:color w:val="0563C1" w:themeColor="hyperlink"/>
+      <w:u w:val="single"/>
+    </w:rPr>
+  </w:style>
+  <w:style w:type="character" w:styleId="UnresolvedMention">
+    <w:name w:val="Unresolved Mention"/>
+    <w:basedOn w:val="DefaultParagraphFont"/>
+    <w:uiPriority w:val="99"/>
+    <w:semiHidden/>
+    <w:unhideWhenUsed/>
+    <w:rsid w:val="0058407C"/>
+    <w:rPr>
+      <w:color w:val="605E5C"/>
+      <w:shd w:val="clear" w:color="auto" w:fill="E1DFDD"/>
     </w:rPr>
   </w:style>
 </w:styles>

</xml_diff>

<commit_message>
Tested STT,LLM,TTS pipeline component locally by simulation
</commit_message>
<xml_diff>
--- a/docs/Architecture.docx
+++ b/docs/Architecture.docx
@@ -23,8 +23,13 @@
       </w:r>
     </w:p>
     <w:p>
-      <w:r>
-        <w:t>LiveKit agent</w:t>
+      <w:proofErr w:type="spellStart"/>
+      <w:r>
+        <w:t>LiveKit</w:t>
+      </w:r>
+      <w:proofErr w:type="spellEnd"/>
+      <w:r>
+        <w:t xml:space="preserve"> agent</w:t>
       </w:r>
     </w:p>
     <w:p>
@@ -95,7 +100,15 @@
     <w:p/>
     <w:p>
       <w:r>
-        <w:t>You need the telephony provider to:</w:t>
+        <w:t xml:space="preserve">You need the telephony provider </w:t>
+      </w:r>
+      <w:proofErr w:type="gramStart"/>
+      <w:r>
+        <w:t>to</w:t>
+      </w:r>
+      <w:proofErr w:type="gramEnd"/>
+      <w:r>
+        <w:t>:</w:t>
       </w:r>
     </w:p>
     <w:p>
@@ -117,7 +130,15 @@
         </w:numPr>
       </w:pPr>
       <w:r>
-        <w:t>Stream caller audio to LiveKit.</w:t>
+        <w:t xml:space="preserve">Stream caller audio to </w:t>
+      </w:r>
+      <w:proofErr w:type="spellStart"/>
+      <w:r>
+        <w:t>LiveKit</w:t>
+      </w:r>
+      <w:proofErr w:type="spellEnd"/>
+      <w:r>
+        <w:t>.</w:t>
       </w:r>
     </w:p>
     <w:p>
@@ -128,7 +149,15 @@
         </w:numPr>
       </w:pPr>
       <w:r>
-        <w:t>Receive synthesized audio from LiveKit.</w:t>
+        <w:t xml:space="preserve">Receive synthesized audio from </w:t>
+      </w:r>
+      <w:proofErr w:type="spellStart"/>
+      <w:r>
+        <w:t>LiveKit</w:t>
+      </w:r>
+      <w:proofErr w:type="spellEnd"/>
+      <w:r>
+        <w:t>.</w:t>
       </w:r>
     </w:p>
     <w:p>
@@ -147,7 +176,15 @@
     <w:p/>
     <w:p>
       <w:r>
-        <w:t>A SIP trunk lets software—here, LiveKit—enter that phone network and place a real call.</w:t>
+        <w:t xml:space="preserve">A SIP trunk lets software—here, </w:t>
+      </w:r>
+      <w:proofErr w:type="spellStart"/>
+      <w:r>
+        <w:t>LiveKit</w:t>
+      </w:r>
+      <w:proofErr w:type="spellEnd"/>
+      <w:r>
+        <w:t>—enter that phone network and place a real call.</w:t>
       </w:r>
     </w:p>
     <w:p/>
@@ -248,8 +285,13 @@
       </w:r>
     </w:p>
     <w:p>
-      <w:r>
-        <w:t>Gradium TTS</w:t>
+      <w:proofErr w:type="spellStart"/>
+      <w:r>
+        <w:t>Gradium</w:t>
+      </w:r>
+      <w:proofErr w:type="spellEnd"/>
+      <w:r>
+        <w:t xml:space="preserve"> TTS</w:t>
       </w:r>
       <w:r>
         <w:t xml:space="preserve">   -- </w:t>
@@ -267,35 +309,73 @@
         </w:rPr>
       </w:pPr>
       <w:r>
-        <w:t xml:space="preserve">Watch for each models : </w:t>
+        <w:t xml:space="preserve">Watch for each </w:t>
+      </w:r>
+      <w:proofErr w:type="gramStart"/>
+      <w:r>
+        <w:t>models :</w:t>
+      </w:r>
+      <w:proofErr w:type="gramEnd"/>
+      <w:r>
+        <w:t xml:space="preserve"> </w:t>
       </w:r>
       <w:r>
         <w:rPr>
           <w:color w:val="EE0000"/>
         </w:rPr>
-        <w:t>median time-to-first-audio (TTFA)</w:t>
-      </w:r>
-    </w:p>
-    <w:p>
-      <w:pPr>
+        <w:t>median time-to-</w:t>
+      </w:r>
+      <w:proofErr w:type="gramStart"/>
+      <w:r>
         <w:rPr>
           <w:color w:val="EE0000"/>
         </w:rPr>
-      </w:pPr>
-    </w:p>
-    <w:p>
-      <w:pPr>
-        <w:rPr>
-          <w:b/>
-          <w:bCs/>
-        </w:rPr>
-      </w:pPr>
-      <w:r>
-        <w:rPr>
-          <w:b/>
-          <w:bCs/>
-        </w:rPr>
-        <w:t>How LiveKit Handles the Heavy Lifting</w:t>
+        <w:t>first-audio</w:t>
+      </w:r>
+      <w:proofErr w:type="gramEnd"/>
+      <w:r>
+        <w:rPr>
+          <w:color w:val="EE0000"/>
+        </w:rPr>
+        <w:t xml:space="preserve"> (TTFA)</w:t>
+      </w:r>
+    </w:p>
+    <w:p>
+      <w:pPr>
+        <w:rPr>
+          <w:color w:val="EE0000"/>
+        </w:rPr>
+      </w:pPr>
+    </w:p>
+    <w:p>
+      <w:pPr>
+        <w:rPr>
+          <w:b/>
+          <w:bCs/>
+        </w:rPr>
+      </w:pPr>
+      <w:r>
+        <w:rPr>
+          <w:b/>
+          <w:bCs/>
+        </w:rPr>
+        <w:t xml:space="preserve">How </w:t>
+      </w:r>
+      <w:proofErr w:type="spellStart"/>
+      <w:r>
+        <w:rPr>
+          <w:b/>
+          <w:bCs/>
+        </w:rPr>
+        <w:t>LiveKit</w:t>
+      </w:r>
+      <w:proofErr w:type="spellEnd"/>
+      <w:r>
+        <w:rPr>
+          <w:b/>
+          <w:bCs/>
+        </w:rPr>
+        <w:t xml:space="preserve"> Handles the Heavy Lifting</w:t>
       </w:r>
     </w:p>
     <w:p>
@@ -328,7 +408,31 @@
         <w:t xml:space="preserve"> STT):</w:t>
       </w:r>
       <w:r>
-        <w:t xml:space="preserve"> The user speaks into their mic. LiveKit streams their audio into the room via WebRTC. Your Python/Node.js agent receives this as an audio track. The LiveKit framework automatically converts that WebRTC stream into raw audio buffers (PCM chunks) and feeds them directly into your </w:t>
+        <w:t xml:space="preserve"> The user speaks into their mic. </w:t>
+      </w:r>
+      <w:proofErr w:type="spellStart"/>
+      <w:r>
+        <w:t>LiveKit</w:t>
+      </w:r>
+      <w:proofErr w:type="spellEnd"/>
+      <w:r>
+        <w:t xml:space="preserve"> streams their audio into the room via WebRTC. Your Python/Node.js agent receives this as an audio track. The </w:t>
+      </w:r>
+      <w:proofErr w:type="spellStart"/>
+      <w:r>
+        <w:t>LiveKit</w:t>
+      </w:r>
+      <w:proofErr w:type="spellEnd"/>
+      <w:r>
+        <w:t xml:space="preserve"> framework automatically converts </w:t>
+      </w:r>
+      <w:proofErr w:type="gramStart"/>
+      <w:r>
+        <w:t>that</w:t>
+      </w:r>
+      <w:proofErr w:type="gramEnd"/>
+      <w:r>
+        <w:t xml:space="preserve"> WebRTC stream into raw audio buffers (PCM chunks) and feeds them directly into your </w:t>
       </w:r>
       <w:r>
         <w:rPr>
@@ -429,7 +533,31 @@
         <w:t xml:space="preserve"> User):</w:t>
       </w:r>
       <w:r>
-        <w:t xml:space="preserve"> Mist v3 generates raw audio bytes. You simply push these bytes into a LiveKit AudioSource. The LiveKit framework instantly takes those raw bytes, encodes them (usually using the Opus codec), packages them into RTP packets, and streams them back to the room over </w:t>
+        <w:t xml:space="preserve"> Mist v3 generates raw audio bytes. You simply push these bytes into a </w:t>
+      </w:r>
+      <w:proofErr w:type="spellStart"/>
+      <w:r>
+        <w:t>LiveKit</w:t>
+      </w:r>
+      <w:proofErr w:type="spellEnd"/>
+      <w:r>
+        <w:t xml:space="preserve"> </w:t>
+      </w:r>
+      <w:proofErr w:type="spellStart"/>
+      <w:r>
+        <w:t>AudioSource</w:t>
+      </w:r>
+      <w:proofErr w:type="spellEnd"/>
+      <w:r>
+        <w:t xml:space="preserve">. The </w:t>
+      </w:r>
+      <w:proofErr w:type="spellStart"/>
+      <w:r>
+        <w:t>LiveKit</w:t>
+      </w:r>
+      <w:proofErr w:type="spellEnd"/>
+      <w:r>
+        <w:t xml:space="preserve"> framework instantly takes those raw bytes, encodes them (usually using the Opus codec), packages them into RTP packets, and streams them back to the room over </w:t>
       </w:r>
       <w:r>
         <w:rPr>
@@ -495,8 +623,28 @@
       </w:r>
       <w:r>
         <w:tab/>
-        <w:t>nvidia Canary 180M Flash – vs Opean AI – Distil-Wishper</w:t>
-      </w:r>
+      </w:r>
+      <w:proofErr w:type="spellStart"/>
+      <w:r>
+        <w:t>nvidia</w:t>
+      </w:r>
+      <w:proofErr w:type="spellEnd"/>
+      <w:r>
+        <w:t xml:space="preserve"> Canary 180M Flash – vs </w:t>
+      </w:r>
+      <w:proofErr w:type="spellStart"/>
+      <w:r>
+        <w:t>Opean</w:t>
+      </w:r>
+      <w:proofErr w:type="spellEnd"/>
+      <w:r>
+        <w:t xml:space="preserve"> AI – Distil-</w:t>
+      </w:r>
+      <w:proofErr w:type="spellStart"/>
+      <w:r>
+        <w:t>Wishper</w:t>
+      </w:r>
+      <w:proofErr w:type="spellEnd"/>
     </w:p>
     <w:p/>
     <w:p/>
@@ -551,7 +699,23 @@
           <w:b/>
           <w:bCs/>
         </w:rPr>
-        <w:t>Free version of LiveKit (</w:t>
+        <w:t xml:space="preserve">Free version of </w:t>
+      </w:r>
+      <w:proofErr w:type="spellStart"/>
+      <w:r>
+        <w:rPr>
+          <w:b/>
+          <w:bCs/>
+        </w:rPr>
+        <w:t>LiveKit</w:t>
+      </w:r>
+      <w:proofErr w:type="spellEnd"/>
+      <w:r>
+        <w:rPr>
+          <w:b/>
+          <w:bCs/>
+        </w:rPr>
+        <w:t xml:space="preserve"> (</w:t>
       </w:r>
       <w:r>
         <w:rPr>
@@ -646,8 +810,13 @@
             <w:hideMark/>
           </w:tcPr>
           <w:p>
+            <w:proofErr w:type="spellStart"/>
             <w:r>
-              <w:t>Nemotron TTS</w:t>
+              <w:t>Nemotron</w:t>
+            </w:r>
+            <w:proofErr w:type="spellEnd"/>
+            <w:r>
+              <w:t xml:space="preserve"> TTS</w:t>
             </w:r>
           </w:p>
         </w:tc>
@@ -703,8 +872,13 @@
             <w:hideMark/>
           </w:tcPr>
           <w:p>
+            <w:proofErr w:type="spellStart"/>
             <w:r>
-              <w:t>gRPC (port 50051), HTTP (port 9000)</w:t>
+              <w:t>gRPC</w:t>
+            </w:r>
+            <w:proofErr w:type="spellEnd"/>
+            <w:r>
+              <w:t xml:space="preserve"> (port 50051), HTTP (port 9000)</w:t>
             </w:r>
           </w:p>
         </w:tc>
@@ -712,8 +886,13 @@
     </w:tbl>
     <w:p/>
     <w:p>
-      <w:r>
-        <w:t xml:space="preserve">Cnary 180M Flash – No </w:t>
+      <w:proofErr w:type="spellStart"/>
+      <w:r>
+        <w:t>Cnary</w:t>
+      </w:r>
+      <w:proofErr w:type="spellEnd"/>
+      <w:r>
+        <w:t xml:space="preserve"> 180M Flash – No </w:t>
       </w:r>
       <w:r>
         <w:t>inverse text normalization (ITN)</w:t>
@@ -728,6 +907,138 @@
         <w:t xml:space="preserve"> 10</w:t>
       </w:r>
     </w:p>
+    <w:p/>
+    <w:p>
+      <w:r>
+        <w:t>LLM Selection – cost wise:</w:t>
+      </w:r>
+      <w:r>
+        <w:br/>
+      </w:r>
+      <w:r>
+        <w:rPr>
+          <w:noProof/>
+        </w:rPr>
+        <mc:AlternateContent>
+          <mc:Choice Requires="wps">
+            <w:drawing>
+              <wp:inline distT="0" distB="0" distL="0" distR="0" wp14:anchorId="557E6B1F" wp14:editId="11BB4761">
+                <wp:extent cx="304800" cy="304800"/>
+                <wp:effectExtent l="0" t="0" r="0" b="0"/>
+                <wp:docPr id="57350776" name="Rectangle 1" descr="an image of a performance to cost comparison chart"/>
+                <wp:cNvGraphicFramePr>
+                  <a:graphicFrameLocks xmlns:a="http://schemas.openxmlformats.org/drawingml/2006/main" noChangeAspect="1"/>
+                </wp:cNvGraphicFramePr>
+                <a:graphic xmlns:a="http://schemas.openxmlformats.org/drawingml/2006/main">
+                  <a:graphicData uri="http://schemas.microsoft.com/office/word/2010/wordprocessingShape">
+                    <wps:wsp>
+                      <wps:cNvSpPr>
+                        <a:spLocks noChangeAspect="1" noChangeArrowheads="1"/>
+                      </wps:cNvSpPr>
+                      <wps:spPr bwMode="auto">
+                        <a:xfrm>
+                          <a:off x="0" y="0"/>
+                          <a:ext cx="304800" cy="304800"/>
+                        </a:xfrm>
+                        <a:prstGeom prst="rect">
+                          <a:avLst/>
+                        </a:prstGeom>
+                        <a:noFill/>
+                        <a:ln>
+                          <a:noFill/>
+                        </a:ln>
+                        <a:extLst>
+                          <a:ext uri="{909E8E84-426E-40DD-AFC4-6F175D3DCCD1}">
+                            <a14:hiddenFill xmlns:a14="http://schemas.microsoft.com/office/drawing/2010/main">
+                              <a:solidFill>
+                                <a:srgbClr val="FFFFFF"/>
+                              </a:solidFill>
+                            </a14:hiddenFill>
+                          </a:ext>
+                          <a:ext uri="{91240B29-F687-4F45-9708-019B960494DF}">
+                            <a14:hiddenLine xmlns:a14="http://schemas.microsoft.com/office/drawing/2010/main" w="9525">
+                              <a:solidFill>
+                                <a:srgbClr val="000000"/>
+                              </a:solidFill>
+                              <a:miter lim="800000"/>
+                              <a:headEnd/>
+                              <a:tailEnd/>
+                            </a14:hiddenLine>
+                          </a:ext>
+                        </a:extLst>
+                      </wps:spPr>
+                      <wps:bodyPr rot="0" vert="horz" wrap="square" lIns="91440" tIns="45720" rIns="91440" bIns="45720" anchor="t" anchorCtr="0" upright="1">
+                        <a:noAutofit/>
+                      </wps:bodyPr>
+                    </wps:wsp>
+                  </a:graphicData>
+                </a:graphic>
+              </wp:inline>
+            </w:drawing>
+          </mc:Choice>
+          <mc:Fallback>
+            <w:pict>
+              <v:rect w14:anchorId="0F379D56" id="Rectangle 1" o:spid="_x0000_s1026" alt="an image of a performance to cost comparison chart" style="width:24pt;height:24pt;visibility:visible;mso-wrap-style:square;mso-left-percent:-10001;mso-top-percent:-10001;mso-position-horizontal:absolute;mso-position-horizontal-relative:char;mso-position-vertical:absolute;mso-position-vertical-relative:line;mso-left-percent:-10001;mso-top-percent:-10001;v-text-anchor:top" o:gfxdata="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" filled="f" stroked="f">
+                <o:lock v:ext="edit" aspectratio="t"/>
+                <w10:anchorlock/>
+              </v:rect>
+            </w:pict>
+          </mc:Fallback>
+        </mc:AlternateContent>
+      </w:r>
+      <w:r>
+        <w:rPr>
+          <w:noProof/>
+        </w:rPr>
+        <w:drawing>
+          <wp:inline distT="0" distB="0" distL="0" distR="0" wp14:anchorId="60B22E33" wp14:editId="2B7B3F03">
+            <wp:extent cx="3959225" cy="2227063"/>
+            <wp:effectExtent l="0" t="0" r="3175" b="1905"/>
+            <wp:docPr id="1710356542" name="Picture 2"/>
+            <wp:cNvGraphicFramePr>
+              <a:graphicFrameLocks xmlns:a="http://schemas.openxmlformats.org/drawingml/2006/main" noChangeAspect="1"/>
+            </wp:cNvGraphicFramePr>
+            <a:graphic xmlns:a="http://schemas.openxmlformats.org/drawingml/2006/main">
+              <a:graphicData uri="http://schemas.openxmlformats.org/drawingml/2006/picture">
+                <pic:pic xmlns:pic="http://schemas.openxmlformats.org/drawingml/2006/picture">
+                  <pic:nvPicPr>
+                    <pic:cNvPr id="0" name="Picture 2"/>
+                    <pic:cNvPicPr>
+                      <a:picLocks noChangeAspect="1" noChangeArrowheads="1"/>
+                    </pic:cNvPicPr>
+                  </pic:nvPicPr>
+                  <pic:blipFill>
+                    <a:blip r:embed="rId8" cstate="print">
+                      <a:extLst>
+                        <a:ext uri="{28A0092B-C50C-407E-A947-70E740481C1C}">
+                          <a14:useLocalDpi xmlns:a14="http://schemas.microsoft.com/office/drawing/2010/main" val="0"/>
+                        </a:ext>
+                      </a:extLst>
+                    </a:blip>
+                    <a:srcRect/>
+                    <a:stretch>
+                      <a:fillRect/>
+                    </a:stretch>
+                  </pic:blipFill>
+                  <pic:spPr bwMode="auto">
+                    <a:xfrm>
+                      <a:off x="0" y="0"/>
+                      <a:ext cx="3995885" cy="2247684"/>
+                    </a:xfrm>
+                    <a:prstGeom prst="rect">
+                      <a:avLst/>
+                    </a:prstGeom>
+                    <a:noFill/>
+                  </pic:spPr>
+                </pic:pic>
+              </a:graphicData>
+            </a:graphic>
+          </wp:inline>
+        </w:drawing>
+      </w:r>
+    </w:p>
+    <w:p/>
+    <w:p/>
     <w:sectPr>
       <w:pgSz w:w="12240" w:h="15840"/>
       <w:pgMar w:top="1440" w:right="1440" w:bottom="1440" w:left="1440" w:header="720" w:footer="720" w:gutter="0"/>
@@ -1577,6 +1888,7 @@
   <w:style w:type="character" w:default="1" w:styleId="DefaultParagraphFont">
     <w:name w:val="Default Paragraph Font"/>
     <w:uiPriority w:val="1"/>
+    <w:semiHidden/>
     <w:unhideWhenUsed/>
   </w:style>
   <w:style w:type="table" w:default="1" w:styleId="TableNormal">

</xml_diff>

<commit_message>
Succesfully completed First Test Call
</commit_message>
<xml_diff>
--- a/docs/Architecture.docx
+++ b/docs/Architecture.docx
@@ -1038,6 +1038,46 @@
       </w:r>
     </w:p>
     <w:p/>
+    <w:p>
+      <w:r>
+        <w:lastRenderedPageBreak/>
+        <w:drawing>
+          <wp:inline distT="0" distB="0" distL="0" distR="0" wp14:anchorId="149CED80" wp14:editId="0D51FB0B">
+            <wp:extent cx="4064924" cy="2283915"/>
+            <wp:effectExtent l="0" t="0" r="0" b="2540"/>
+            <wp:docPr id="806910085" name="Picture 1"/>
+            <wp:cNvGraphicFramePr>
+              <a:graphicFrameLocks xmlns:a="http://schemas.openxmlformats.org/drawingml/2006/main" noChangeAspect="1"/>
+            </wp:cNvGraphicFramePr>
+            <a:graphic xmlns:a="http://schemas.openxmlformats.org/drawingml/2006/main">
+              <a:graphicData uri="http://schemas.openxmlformats.org/drawingml/2006/picture">
+                <pic:pic xmlns:pic="http://schemas.openxmlformats.org/drawingml/2006/picture">
+                  <pic:nvPicPr>
+                    <pic:cNvPr id="806910085" name=""/>
+                    <pic:cNvPicPr/>
+                  </pic:nvPicPr>
+                  <pic:blipFill>
+                    <a:blip r:embed="rId9"/>
+                    <a:stretch>
+                      <a:fillRect/>
+                    </a:stretch>
+                  </pic:blipFill>
+                  <pic:spPr>
+                    <a:xfrm>
+                      <a:off x="0" y="0"/>
+                      <a:ext cx="4083927" cy="2294592"/>
+                    </a:xfrm>
+                    <a:prstGeom prst="rect">
+                      <a:avLst/>
+                    </a:prstGeom>
+                  </pic:spPr>
+                </pic:pic>
+              </a:graphicData>
+            </a:graphic>
+          </wp:inline>
+        </w:drawing>
+      </w:r>
+    </w:p>
     <w:p/>
     <w:sectPr>
       <w:pgSz w:w="12240" w:h="15840"/>

</xml_diff>